<commit_message>
chore: retire le service de test whoami et aligne la documentation
- compose : suppression du service et de son alias DNS (9 services metier)
- test-routing.sh cible Moodle
- rapport de scan du service retire supprime
- README, GitBook, pages d'architecture et synthese alignes
</commit_message>
<xml_diff>
--- a/CR465-synthese-groupe-D.docx
+++ b/CR465-synthese-groupe-D.docx
@@ -1855,36 +1855,6 @@
           </w:p>
         </w:tc>
       </w:tr>
-      <w:tr>
-        <w:tc>
-          <w:tcPr>
-            <w:tcW w:type="dxa" w:w="3515"/>
-          </w:tcPr>
-          <w:p>
-            <w:r/>
-            <w:r>
-              <w:rPr>
-                <w:sz w:val="18"/>
-              </w:rPr>
-              <w:t>whoami conservé</w:t>
-            </w:r>
-          </w:p>
-        </w:tc>
-        <w:tc>
-          <w:tcPr>
-            <w:tcW w:type="dxa" w:w="5839"/>
-          </w:tcPr>
-          <w:p>
-            <w:r/>
-            <w:r>
-              <w:rPr>
-                <w:sz w:val="18"/>
-              </w:rPr>
-              <w:t>Service de test, 15 vulnérabilités HIGH, à retirer avant la remise</w:t>
-            </w:r>
-          </w:p>
-        </w:tc>
-      </w:tr>
     </w:tbl>
     <w:p>
       <w:pPr>

</xml_diff>

<commit_message>
feat(n8n): cree le compte Moodle de l acheteur avant de l inscrire
- nouveau noeud core_user_create_users (auth=oauth2, onError continue)
- corrige la reference $json.body.email dans la recherche apres insertion du noeud
- parcours idempotent : 1 seule inscription pour un email deja connu
- documentation, GitBook et synthese mises a jour
</commit_message>
<xml_diff>
--- a/CR465-synthese-groupe-D.docx
+++ b/CR465-synthese-groupe-D.docx
@@ -1207,7 +1207,7 @@
           <w:b w:val="0"/>
           <w:i w:val="0"/>
         </w:rPr>
-        <w:t>Le parcours attendu est opérationnel. Drupal Commerce déclenche un webhook signé lorsqu'une commande passe à l'état « completed » ; n8n recherche l'apprenant dans Moodle puis l'inscrit au cours via l'API REST, avec un compte de service à privilèges limités (aucun accès administrateur).</w:t>
+        <w:t>Le parcours attendu est opérationnel. Drupal Commerce déclenche un webhook signé lorsqu'une commande passe à l'état « completed » ; n8n crée le compte Moodle s'il n'existe pas, puis inscrit l'apprenant au cours via l'API REST, avec un compte de service à privilèges limités (aucun accès administrateur).</w:t>
       </w:r>
     </w:p>
     <w:p>
@@ -1776,36 +1776,6 @@
               <w:rPr>
                 <w:sz w:val="18"/>
               </w:rPr>
-              <w:t>Création de compte Moodle</w:t>
-            </w:r>
-          </w:p>
-        </w:tc>
-        <w:tc>
-          <w:tcPr>
-            <w:tcW w:type="dxa" w:w="5839"/>
-          </w:tcPr>
-          <w:p>
-            <w:r/>
-            <w:r>
-              <w:rPr>
-                <w:sz w:val="18"/>
-              </w:rPr>
-              <w:t>Assurée par le premier login SSO ; création par n8n à ajouter</w:t>
-            </w:r>
-          </w:p>
-        </w:tc>
-      </w:tr>
-      <w:tr>
-        <w:tc>
-          <w:tcPr>
-            <w:tcW w:type="dxa" w:w="3515"/>
-          </w:tcPr>
-          <w:p>
-            <w:r/>
-            <w:r>
-              <w:rPr>
-                <w:sz w:val="18"/>
-              </w:rPr>
               <w:t>Signature HMAC du webhook</w:t>
             </w:r>
           </w:p>

</xml_diff>

<commit_message>
feat(securite): verification HMAC du webhook et whoami sous profil test
- n8n recalcule le HMAC-SHA256 et rejette en 401 toute requete non signee
- webhook en rawBody, secret injecte au rendu (jamais versionne)
- whoami reintroduit sous profiles:[test], sans route Traefik, reseau app
- page defense en profondeur alignee sur la numerotation 0-6 de l equipe
- docs, GitBook, CHANGELOG et synthese mis a jour
</commit_message>
<xml_diff>
--- a/CR465-synthese-groupe-D.docx
+++ b/CR465-synthese-groupe-D.docx
@@ -1776,36 +1776,6 @@
               <w:rPr>
                 <w:sz w:val="18"/>
               </w:rPr>
-              <w:t>Signature HMAC du webhook</w:t>
-            </w:r>
-          </w:p>
-        </w:tc>
-        <w:tc>
-          <w:tcPr>
-            <w:tcW w:type="dxa" w:w="5839"/>
-          </w:tcPr>
-          <w:p>
-            <w:r/>
-            <w:r>
-              <w:rPr>
-                <w:sz w:val="18"/>
-              </w:rPr>
-              <w:t>Émise par Drupal, pas encore vérifiée par n8n</w:t>
-            </w:r>
-          </w:p>
-        </w:tc>
-      </w:tr>
-      <w:tr>
-        <w:tc>
-          <w:tcPr>
-            <w:tcW w:type="dxa" w:w="3515"/>
-          </w:tcPr>
-          <w:p>
-            <w:r/>
-            <w:r>
-              <w:rPr>
-                <w:sz w:val="18"/>
-              </w:rPr>
               <w:t>Certificat auto-signé</w:t>
             </w:r>
           </w:p>

</xml_diff>